<commit_message>
Regenerate es download bundles
</commit_message>
<xml_diff>
--- a/static/downloads/de/docx/layer-0/identity-constraints-register.docx
+++ b/static/downloads/de/docx/layer-0/identity-constraints-register.docx
@@ -87,7 +87,7 @@
         <w:t xml:space="preserve"> </w:t>
       </w:r>
       <w:r>
-        <w:t xml:space="preserve">2026-04-28</w:t>
+        <w:t xml:space="preserve">2026-04-29</w:t>
       </w:r>
     </w:p>
     <w:p>
@@ -374,7 +374,7 @@
         <w:pStyle w:val="BlockText"/>
       </w:pPr>
       <w:r>
-        <w:t xml:space="preserve">Jede Beschränkung muss durch einen definierten Prozess überprüfbar und durchsetzbar sein — keine vagen Bestrebungen. Gängige Kategorien aus RCOS §2.4.2: ethische/verhaltensbezogene Grenzen, Teilnahmevoraussetzungen, nicht verhandelbare kulturelle oder ökologische Beschränkungen. Verweise auf Ebene 4 für die Durchsetzung, Ebene 1 für Teilnahmekonsequenzen.</w:t>
+        <w:t xml:space="preserve">Jede Beschränkung muss durch einen definierten Prozess überprüfbar und durchsetzbar sein — keine vagen Bestrebungen. Gängige Kategorien aus RCOS §2.4.2: ethische/verhaltensbezogene Grenzen, Teilnahmevoraussetzungen, nicht verhandelbare kulturelle oder ökologische Beschränkungen. Verweise auf Schicht 4 für die Durchsetzung, Schicht 1 für Teilnahmekonsequenzen.</w:t>
       </w:r>
     </w:p>
     <w:p>
@@ -605,7 +605,7 @@
         <w:pStyle w:val="BlockText"/>
       </w:pPr>
       <w:r>
-        <w:t xml:space="preserve">Beschreibe für jede oben genannte Beschränkung (oder als allgemeine Richtlinie), wie ein Verstoß erkannt und behandelt wird. Verweise auf die Konfliktlösungsleiter (Ebene 4) und alle für die Überwachung zuständigen Rollen (Ebene 5).</w:t>
+        <w:t xml:space="preserve">Beschreibe für jede oben genannte Beschränkung (oder als allgemeine Richtlinie), wie ein Verstoß erkannt und behandelt wird. Verweise auf die Konfliktlösungsleiter (Schicht 4) und alle für die Überwachung zuständigen Rollen (Schicht 5).</w:t>
       </w:r>
     </w:p>
     <w:p>
@@ -744,7 +744,7 @@
         <w:pStyle w:val="FirstParagraph"/>
       </w:pPr>
       <w:r>
-        <w:t xml:space="preserve">Identitätsbeschränkungen dürfen nur durch eine Verfassungsentscheidung gemäß der Entscheidungsmatrix (Ebene 2) hinzugefügt, entfernt oder geändert werden, wobei</w:t>
+        <w:t xml:space="preserve">Identitätsbeschränkungen dürfen nur durch eine Verfassungsentscheidung gemäß der Entscheidungsmatrix (Schicht 2) hinzugefügt, entfernt oder geändert werden, wobei</w:t>
       </w:r>
       <w:r>
         <w:t xml:space="preserve"> </w:t>
@@ -762,7 +762,7 @@
         <w:t xml:space="preserve"> </w:t>
       </w:r>
       <w:r>
-        <w:t xml:space="preserve">einzuhalten ist. Jede Änderung muss in der Versionshistorie (Ebene 6) dokumentiert werden.</w:t>
+        <w:t xml:space="preserve">einzuhalten ist. Jede Änderung muss in der Versionshistorie (Schicht 6) dokumentiert werden.</w:t>
       </w:r>
     </w:p>
     <w:p>

</xml_diff>

<commit_message>
Fixed display errors in some templates - needed to regenerate the files
</commit_message>
<xml_diff>
--- a/static/downloads/de/docx/layer-0/identity-constraints-register.docx
+++ b/static/downloads/de/docx/layer-0/identity-constraints-register.docx
@@ -87,7 +87,7 @@
         <w:t xml:space="preserve"> </w:t>
       </w:r>
       <w:r>
-        <w:t xml:space="preserve">2026-06-26</w:t>
+        <w:t xml:space="preserve">2026-07-07</w:t>
       </w:r>
     </w:p>
     <w:p>
@@ -238,10 +238,10 @@
     </w:p>
     <w:p>
       <w:pPr>
-        <w:pStyle w:val="BlockText"/>
-      </w:pPr>
-      <w:r>
-        <w:t xml:space="preserve">Identitätsbeschränkungen sind die nicht verhandelbaren verhaltensbezogenen, ethischen und strukturellen Grenzen, die bestimmen, wer die Gemeinschaft ist. Anders als Invarianten (die das System selbst schützen) definieren Identitätsbeschränkungen, wie Mitglieder und die Gemeinschaft sich zu Menschen, Ökosystemen und Ideologien verhalten.</w:t>
+        <w:pStyle w:val="FirstParagraph"/>
+      </w:pPr>
+      <w:r>
+        <w:t xml:space="preserve">&gt; Identitätsbeschränkungen sind die nicht verhandelbaren verhaltensbezogenen, ethischen und strukturellen Grenzen, die bestimmen, wer die Gemeinschaft ist. Anders als Invarianten (die das System selbst schützen) definieren Identitätsbeschränkungen, wie Mitglieder und die Gemeinschaft sich zu Menschen, Ökosystemen und Ideologien verhalten.</w:t>
       </w:r>
     </w:p>
     <w:p>
@@ -339,8 +339,14 @@
     </w:p>
     <w:p>
       <w:pPr>
-        <w:pStyle w:val="BlockText"/>
-      </w:pPr>
+        <w:pStyle w:val="BodyText"/>
+      </w:pPr>
+      <w:r>
+        <w:t xml:space="preserve">&gt;</w:t>
+      </w:r>
+      <w:r>
+        <w:t xml:space="preserve"> </w:t>
+      </w:r>
       <w:r>
         <w:rPr>
           <w:b/>
@@ -348,19 +354,29 @@
         </w:rPr>
         <w:t xml:space="preserve">Begründung — Warum Identitätsbeschränkungen explizit festhalten</w:t>
       </w:r>
-    </w:p>
-    <w:p>
-      <w:pPr>
-        <w:pStyle w:val="BlockText"/>
-      </w:pPr>
-      <w:r>
-        <w:t xml:space="preserve">Jede Gemeinschaft hat implizite Regeln — „das machen wir hier nicht.“ Implizite Regeln werden zu Werkzeugen willkürlicher Durchsetzung: Wer soziale Macht hat, bestimmt, was sie bedeuten. Identitätsbeschränkungen aufzuschreiben und zu verlangen, dass sie durch definierte Prozesse überprüfbar sind, macht aus einer informellen Norm etwas, auf das sich ein Mitglied tatsächlich verlassen oder das es anfechten kann.</w:t>
-      </w:r>
-    </w:p>
-    <w:p>
-      <w:pPr>
-        <w:pStyle w:val="BlockText"/>
-      </w:pPr>
+      <w:r>
+        <w:t xml:space="preserve"> </w:t>
+      </w:r>
+      <w:r>
+        <w:t xml:space="preserve">&gt;</w:t>
+      </w:r>
+      <w:r>
+        <w:t xml:space="preserve"> </w:t>
+      </w:r>
+      <w:r>
+        <w:t xml:space="preserve">&gt; Jede Gemeinschaft hat implizite Regeln — „das machen wir hier nicht.“ Implizite Regeln werden zu Werkzeugen willkürlicher Durchsetzung: Wer soziale Macht hat, bestimmt, was sie bedeuten. Identitätsbeschränkungen aufzuschreiben und zu verlangen, dass sie durch definierte Prozesse überprüfbar sind, macht aus einer informellen Norm etwas, auf das sich ein Mitglied tatsächlich verlassen oder das es anfechten kann.</w:t>
+      </w:r>
+    </w:p>
+    <w:p>
+      <w:pPr>
+        <w:pStyle w:val="BodyText"/>
+      </w:pPr>
+      <w:r>
+        <w:t xml:space="preserve">&gt;</w:t>
+      </w:r>
+      <w:r>
+        <w:t xml:space="preserve"> </w:t>
+      </w:r>
       <w:r>
         <w:rPr>
           <w:b/>
@@ -368,13 +384,17 @@
         </w:rPr>
         <w:t xml:space="preserve">Anleitung — Wie du diesen Abschnitt ausfüllst</w:t>
       </w:r>
-    </w:p>
-    <w:p>
-      <w:pPr>
-        <w:pStyle w:val="BlockText"/>
-      </w:pPr>
-      <w:r>
-        <w:t xml:space="preserve">Jede Beschränkung muss durch einen definierten Prozess überprüfbar und durchsetzbar sein — keine vagen Bestrebungen. Gängige Kategorien aus RCOS §2.4.2: ethische/verhaltensbezogene Grenzen, Teilnahmevoraussetzungen, nicht verhandelbare kulturelle oder ökologische Beschränkungen. Verweise auf Schicht 4 für die Durchsetzung, Schicht 1 für Teilnahmekonsequenzen.</w:t>
+      <w:r>
+        <w:t xml:space="preserve"> </w:t>
+      </w:r>
+      <w:r>
+        <w:t xml:space="preserve">&gt;</w:t>
+      </w:r>
+      <w:r>
+        <w:t xml:space="preserve"> </w:t>
+      </w:r>
+      <w:r>
+        <w:t xml:space="preserve">&gt; Jede Beschränkung muss durch einen definierten Prozess überprüfbar und durchsetzbar sein — keine vagen Bestrebungen. Gängige Kategorien aus RCOS §2.4.2: ethische/verhaltensbezogene Grenzen, Teilnahmevoraussetzungen, nicht verhandelbare kulturelle oder ökologische Beschränkungen. Verweise auf Schicht 4 für die Durchsetzung, Schicht 1 für Teilnahmekonsequenzen.</w:t>
       </w:r>
     </w:p>
     <w:p>
@@ -570,8 +590,14 @@
     </w:p>
     <w:p>
       <w:pPr>
-        <w:pStyle w:val="BlockText"/>
-      </w:pPr>
+        <w:pStyle w:val="BodyText"/>
+      </w:pPr>
+      <w:r>
+        <w:t xml:space="preserve">&gt;</w:t>
+      </w:r>
+      <w:r>
+        <w:t xml:space="preserve"> </w:t>
+      </w:r>
       <w:r>
         <w:rPr>
           <w:b/>
@@ -579,19 +605,29 @@
         </w:rPr>
         <w:t xml:space="preserve">Begründung — Warum müssen Beschränkungen überprüfbar sein und nicht informell</w:t>
       </w:r>
-    </w:p>
-    <w:p>
-      <w:pPr>
-        <w:pStyle w:val="BlockText"/>
-      </w:pPr>
-      <w:r>
-        <w:t xml:space="preserve">Eine Beschränkung, die nicht überprüft werden kann, ist eine Beschränkung, die von demjenigen durchgesetzt wird, der das meiste soziale Kapital im Raum hat. Zu definieren, wie jede Beschränkung erkannt wird, wer sie anspricht und durch welchen Prozess sie gelöst wird, verhindert, dass Identitätsregeln zu Werkzeugen willkürlichen Ausschlusses werden.</w:t>
-      </w:r>
-    </w:p>
-    <w:p>
-      <w:pPr>
-        <w:pStyle w:val="BlockText"/>
-      </w:pPr>
+      <w:r>
+        <w:t xml:space="preserve"> </w:t>
+      </w:r>
+      <w:r>
+        <w:t xml:space="preserve">&gt;</w:t>
+      </w:r>
+      <w:r>
+        <w:t xml:space="preserve"> </w:t>
+      </w:r>
+      <w:r>
+        <w:t xml:space="preserve">&gt; Eine Beschränkung, die nicht überprüft werden kann, ist eine Beschränkung, die von demjenigen durchgesetzt wird, der das meiste soziale Kapital im Raum hat. Zu definieren, wie jede Beschränkung erkannt wird, wer sie anspricht und durch welchen Prozess sie gelöst wird, verhindert, dass Identitätsregeln zu Werkzeugen willkürlichen Ausschlusses werden.</w:t>
+      </w:r>
+    </w:p>
+    <w:p>
+      <w:pPr>
+        <w:pStyle w:val="BodyText"/>
+      </w:pPr>
+      <w:r>
+        <w:t xml:space="preserve">&gt;</w:t>
+      </w:r>
+      <w:r>
+        <w:t xml:space="preserve"> </w:t>
+      </w:r>
       <w:r>
         <w:rPr>
           <w:b/>
@@ -599,13 +635,17 @@
         </w:rPr>
         <w:t xml:space="preserve">Anleitung — Wie du diesen Abschnitt ausfüllst</w:t>
       </w:r>
-    </w:p>
-    <w:p>
-      <w:pPr>
-        <w:pStyle w:val="BlockText"/>
-      </w:pPr>
-      <w:r>
-        <w:t xml:space="preserve">Beschreibe für jede oben genannte Beschränkung (oder als allgemeine Richtlinie), wie ein Verstoß erkannt und behandelt wird. Verweise auf die Konfliktlösungsleiter (Schicht 4) und alle für die Überwachung zuständigen Rollen (Schicht 5).</w:t>
+      <w:r>
+        <w:t xml:space="preserve"> </w:t>
+      </w:r>
+      <w:r>
+        <w:t xml:space="preserve">&gt;</w:t>
+      </w:r>
+      <w:r>
+        <w:t xml:space="preserve"> </w:t>
+      </w:r>
+      <w:r>
+        <w:t xml:space="preserve">&gt; Beschreibe für jede oben genannte Beschränkung (oder als allgemeine Richtlinie), wie ein Verstoß erkannt und behandelt wird. Verweise auf die Konfliktlösungsleiter (Schicht 4) und alle für die Überwachung zuständigen Rollen (Schicht 5).</w:t>
       </w:r>
     </w:p>
     <w:p>
@@ -721,8 +761,14 @@
     </w:p>
     <w:p>
       <w:pPr>
-        <w:pStyle w:val="BlockText"/>
-      </w:pPr>
+        <w:pStyle w:val="BodyText"/>
+      </w:pPr>
+      <w:r>
+        <w:t xml:space="preserve">&gt;</w:t>
+      </w:r>
+      <w:r>
+        <w:t xml:space="preserve"> </w:t>
+      </w:r>
       <w:r>
         <w:rPr>
           <w:b/>
@@ -730,18 +776,22 @@
         </w:rPr>
         <w:t xml:space="preserve">Anleitung — Wie du diesen Abschnitt ausfüllst</w:t>
       </w:r>
-    </w:p>
-    <w:p>
-      <w:pPr>
-        <w:pStyle w:val="BlockText"/>
-      </w:pPr>
-      <w:r>
-        <w:t xml:space="preserve">Identitätsbeschränkungen sind verfassungsrechtlicher Natur — beschreibe den Entscheidungstyp, die Schwelle und das Ratifizierungsverfahren, die erforderlich sind, um eine Beschränkung hinzuzufügen, zu entfernen oder zu ändern.</w:t>
-      </w:r>
-    </w:p>
-    <w:p>
-      <w:pPr>
-        <w:pStyle w:val="FirstParagraph"/>
+      <w:r>
+        <w:t xml:space="preserve"> </w:t>
+      </w:r>
+      <w:r>
+        <w:t xml:space="preserve">&gt;</w:t>
+      </w:r>
+      <w:r>
+        <w:t xml:space="preserve"> </w:t>
+      </w:r>
+      <w:r>
+        <w:t xml:space="preserve">&gt; Identitätsbeschränkungen sind verfassungsrechtlicher Natur — beschreibe den Entscheidungstyp, die Schwelle und das Ratifizierungsverfahren, die erforderlich sind, um eine Beschränkung hinzuzufügen, zu entfernen oder zu ändern.</w:t>
+      </w:r>
+    </w:p>
+    <w:p>
+      <w:pPr>
+        <w:pStyle w:val="BodyText"/>
       </w:pPr>
       <w:r>
         <w:t xml:space="preserve">Identitätsbeschränkungen dürfen nur durch eine Verfassungsentscheidung gemäß der Entscheidungsmatrix (Schicht 2) hinzugefügt, entfernt oder geändert werden, wobei</w:t>
@@ -750,6 +800,13 @@
         <w:t xml:space="preserve"> </w:t>
       </w:r>
       <w:r>
+        <w:rPr>
+          <w:i/>
+          <w:iCs/>
+        </w:rPr>
+        <w:t xml:space="preserve">&lt;Schwellenwert&gt;</w:t>
+      </w:r>
+      <w:r>
         <w:t xml:space="preserve"> </w:t>
       </w:r>
       <w:r>
@@ -757,6 +814,13 @@
       </w:r>
       <w:r>
         <w:t xml:space="preserve"> </w:t>
+      </w:r>
+      <w:r>
+        <w:rPr>
+          <w:i/>
+          <w:iCs/>
+        </w:rPr>
+        <w:t xml:space="preserve">&lt;Dauer&gt;</w:t>
       </w:r>
       <w:r>
         <w:t xml:space="preserve"> </w:t>
@@ -800,6 +864,9 @@
       <w:r>
         <w:t xml:space="preserve"> </w:t>
       </w:r>
+      <w:r>
+        <w:t xml:space="preserve">&lt;JJJJ-MM-TT&gt;</w:t>
+      </w:r>
     </w:p>
     <w:p>
       <w:pPr>
@@ -841,6 +908,9 @@
       <w:r>
         <w:t xml:space="preserve"> </w:t>
       </w:r>
+      <w:r>
+        <w:t xml:space="preserve">&lt;Version&gt;</w:t>
+      </w:r>
     </w:p>
     <w:p>
       <w:pPr>
@@ -859,6 +929,9 @@
       </w:r>
       <w:r>
         <w:t xml:space="preserve"> </w:t>
+      </w:r>
+      <w:r>
+        <w:t xml:space="preserve">&lt;Link zum Entscheidungsprotokoll&gt;</w:t>
       </w:r>
     </w:p>
     <w:bookmarkEnd w:id="19"/>

</xml_diff>

<commit_message>
Update document generation dates and enhance content structure for RCOS templates
- Updated generation dates from 2026-07-07 to 2026-08-31 in multiple documents including meeting templates, operations manual, role registry, change protocol, experiment template, learning log, version history, and RCOS core specification.
- Added new layer documents (0 to 6) in Portuguese with appropriate metadata.
- Updated binary files for various ODT and ZIP documents to reflect recent changes.
</commit_message>
<xml_diff>
--- a/static/downloads/de/docx/layer-0/identity-constraints-register.docx
+++ b/static/downloads/de/docx/layer-0/identity-constraints-register.docx
@@ -87,7 +87,7 @@
         <w:t xml:space="preserve"> </w:t>
       </w:r>
       <w:r>
-        <w:t xml:space="preserve">2026-07-07</w:t>
+        <w:t xml:space="preserve">2026-08-31</w:t>
       </w:r>
     </w:p>
     <w:p>
@@ -286,6 +286,30 @@
             <w:iCs/>
           </w:rPr>
           <w:t xml:space="preserve">2.4.1</w:t>
+        </w:r>
+      </w:hyperlink>
+      <w:r>
+        <w:rPr>
+          <w:i/>
+          <w:iCs/>
+        </w:rPr>
+        <w:t xml:space="preserve">,</w:t>
+      </w:r>
+      <w:r>
+        <w:rPr>
+          <w:i/>
+          <w:iCs/>
+        </w:rPr>
+        <w:t xml:space="preserve"> </w:t>
+      </w:r>
+      <w:hyperlink r:id="rId14">
+        <w:r>
+          <w:rPr>
+            <w:rStyle w:val="Hyperlink"/>
+            <w:i/>
+            <w:iCs/>
+          </w:rPr>
+          <w:t xml:space="preserve">2.4.2</w:t>
         </w:r>
       </w:hyperlink>
       <w:r>

</xml_diff>